<commit_message>
Graduate Certificate, Business Administration (GCBA) - Louisiana Tech University, May 2026
</commit_message>
<xml_diff>
--- a/pm-resume.docx
+++ b/pm-resume.docx
@@ -1016,9 +1016,27 @@
       <w:r>
         <w:rPr>
           <w:rFonts w:ascii="Franklin Gothic Book" w:eastAsia="Franklin Gothic Book" w:hAnsi="Franklin Gothic Book"/>
-          <w:sz w:val="20"/>
-        </w:rPr>
-        <w:t>Master of Business Administration (MBA), Marketing Concentration - Louisiana Tech University, Winter 2027</w:t>
+          <w:b/>
+          <w:bCs/>
+          <w:sz w:val="20"/>
+        </w:rPr>
+        <w:t>Master of Business Administration (MBA),</w:t>
+      </w:r>
+      <w:r>
+        <w:rPr>
+          <w:rFonts w:ascii="Franklin Gothic Book" w:eastAsia="Franklin Gothic Book" w:hAnsi="Franklin Gothic Book"/>
+          <w:sz w:val="20"/>
+        </w:rPr>
+        <w:t xml:space="preserve"> Marketing Concentration - Louisiana Tech University, Winter </w:t>
+      </w:r>
+      <w:r>
+        <w:rPr>
+          <w:rFonts w:ascii="Franklin Gothic Book" w:eastAsia="Franklin Gothic Book" w:hAnsi="Franklin Gothic Book"/>
+          <w:b/>
+          <w:bCs/>
+          <w:sz w:val="20"/>
+        </w:rPr>
+        <w:t>2027</w:t>
       </w:r>
     </w:p>
     <w:p>
@@ -1030,13 +1048,62 @@
         </w:numPr>
         <w:spacing w:after="0" w:line="235" w:lineRule="auto"/>
         <w:ind w:left="360" w:hanging="180"/>
-      </w:pPr>
-      <w:r>
-        <w:rPr>
-          <w:rFonts w:ascii="Franklin Gothic Book" w:eastAsia="Franklin Gothic Book" w:hAnsi="Franklin Gothic Book"/>
-          <w:sz w:val="20"/>
-        </w:rPr>
-        <w:t>Bachelor of Science (B.Sc.), Systems and Bio-Medical Engineering - Cairo University, Cairo, Egypt</w:t>
+        <w:rPr>
+          <w:rFonts w:ascii="Franklin Gothic Book" w:eastAsia="Franklin Gothic Book" w:hAnsi="Franklin Gothic Book"/>
+          <w:sz w:val="20"/>
+        </w:rPr>
+      </w:pPr>
+      <w:r>
+        <w:rPr>
+          <w:rFonts w:ascii="Franklin Gothic Book" w:eastAsia="Franklin Gothic Book" w:hAnsi="Franklin Gothic Book"/>
+          <w:b/>
+          <w:bCs/>
+          <w:sz w:val="20"/>
+        </w:rPr>
+        <w:t>Graduate Certificate, Business Administration</w:t>
+      </w:r>
+      <w:r>
+        <w:rPr>
+          <w:rFonts w:ascii="Franklin Gothic Book" w:eastAsia="Franklin Gothic Book" w:hAnsi="Franklin Gothic Book"/>
+          <w:sz w:val="20"/>
+        </w:rPr>
+        <w:t xml:space="preserve"> - Louisiana Tech University, May </w:t>
+      </w:r>
+      <w:r>
+        <w:rPr>
+          <w:rFonts w:ascii="Franklin Gothic Book" w:eastAsia="Franklin Gothic Book" w:hAnsi="Franklin Gothic Book"/>
+          <w:b/>
+          <w:bCs/>
+          <w:sz w:val="20"/>
+        </w:rPr>
+        <w:t>2026</w:t>
+      </w:r>
+    </w:p>
+    <w:p>
+      <w:pPr>
+        <w:pStyle w:val="BodyText"/>
+        <w:numPr>
+          <w:ilvl w:val="0"/>
+          <w:numId w:val="1"/>
+        </w:numPr>
+        <w:spacing w:after="0" w:line="235" w:lineRule="auto"/>
+        <w:ind w:left="360" w:hanging="180"/>
+      </w:pPr>
+      <w:r>
+        <w:rPr>
+          <w:rFonts w:ascii="Franklin Gothic Book" w:eastAsia="Franklin Gothic Book" w:hAnsi="Franklin Gothic Book"/>
+          <w:b/>
+          <w:bCs/>
+          <w:sz w:val="20"/>
+        </w:rPr>
+        <w:t>Bachelor of Science (B.Sc.),</w:t>
+      </w:r>
+      <w:r>
+        <w:rPr>
+          <w:rFonts w:ascii="Franklin Gothic Book" w:eastAsia="Franklin Gothic Book" w:hAnsi="Franklin Gothic Book"/>
+          <w:sz w:val="20"/>
+        </w:rPr>
+        <w:t xml:space="preserve"> Systems and Bio-Medical Engineering - Cairo University, Cairo, Egypt</w:t>
       </w:r>
     </w:p>
     <w:p>
@@ -3605,6 +3672,7 @@
   <w:style w:type="paragraph" w:styleId="BodyText">
     <w:name w:val="Body Text"/>
     <w:basedOn w:val="Normal"/>
+    <w:link w:val="BodyTextChar"/>
     <w:pPr>
       <w:spacing w:after="140" w:line="276" w:lineRule="exact"/>
     </w:pPr>
@@ -3758,6 +3826,19 @@
       <w:contextualSpacing/>
     </w:pPr>
   </w:style>
+  <w:style w:type="character" w:customStyle="1" w:styleId="BodyTextChar">
+    <w:name w:val="Body Text Char"/>
+    <w:basedOn w:val="DefaultParagraphFont"/>
+    <w:link w:val="BodyText"/>
+    <w:rsid w:val="00DE5A86"/>
+    <w:rPr>
+      <w:rFonts w:ascii="Calibri" w:eastAsia="Times New Roman" w:hAnsi="Calibri"/>
+      <w:color w:val="000000"/>
+      <w:sz w:val="22"/>
+      <w:szCs w:val="22"/>
+      <w:lang w:eastAsia="en-US" w:bidi="ar-SA"/>
+    </w:rPr>
+  </w:style>
 </w:styles>
 </file>
 

</xml_diff>